<commit_message>
Maj hebdo 2026-07-27 : ajout paragraphe zone grise (Second Thomas Shoal)
Section 6.3 de la note Word amendée avec l'incident du 20 juillet à Second
Thomas Shoal (premier contact physique documenté entre garde-côtes chinois
et marine philippine), seule évolution de crédibilité combinée <=3 (B2/A2)
recensée dans les bulletins depuis la dernière mise à jour de référence.
</commit_message>
<xml_diff>
--- a/documents/Analyse_Capacites_Militaires_Chinoises.docx
+++ b/documents/Analyse_Capacites_Militaires_Chinoises.docx
@@ -2376,6 +2376,21 @@
           <w:szCs w:val="18"/>
         </w:rPr>
         <w:t xml:space="preserve">SOURCE : IISS, The Military Balance 2026, p.258-259</w:t>
+      </w:r>
+    </w:p>
+    <w:p>
+      <w:r>
+        <w:t>Un développement du 20 juillet 2026 illustre concrètement cette dynamique de coercition graduée : lors d'une confrontation près du BRP Sierra Madre (Second Thomas Shoal, Spratleys), un garde-côte chinois a frappé à la tête un marin philippin, le blessant — premier contact physique documenté après plusieurs mois de coercition non létale (canons à eau, lasers) [autorités philippines, B2 ; Département d'État américain, A2]. Pékin conteste cette version et affirme que des embarcations philippines ont appareillé « illégalement » depuis le Sierra Madre et heurté délibérément un navire chinois [porte-parole des garde-côtes chinois via SCMP, B2 — version contestée, non tranchée]. Washington et Canberra ont publiquement qualifié l'action chinoise de « dangereuse » [Département d'État américain, A2]. Ce passage à un contact physique direct constitue une rupture tactique par rapport à la coercition non létale observée les mois précédents ; en l'absence d'autre indicateur convergent (mobilisation additionnelle, changement déclaratoire officiel), aucun élément ne permet à ce stade de le lire comme une décision délibérée d'élever durablement le niveau de la stratégie de zone grise plutôt que comme un épisode d'escalade tactique locale — distinction capacité/intention à maintenir strictement, à réévaluer selon l'évolution de la situation.</w:t>
+      </w:r>
+    </w:p>
+    <w:p>
+      <w:r>
+        <w:rPr>
+          <w:i/>
+          <w:color w:val="595959"/>
+          <w:sz w:val="18"/>
+        </w:rPr>
+        <w:t>SOURCE : autorités philippines/État-major, 20-21/07/2026 [B2] ; Département d'État des États-Unis, communiqué du 21/07/2026 [A2] ; South China Morning Post, 20-21/07/2026 [B2] ; Philstar, 21/07/2026 [B2]</w:t>
       </w:r>
     </w:p>
     <w:p>

</xml_diff>

<commit_message>
MAJ hebdo — note Word : escalade Second Thomas Shoal (20/07/2026)
Ajout d'un paragraphe section 6.3 (stratégie de zone grise) documentant
le premier contact physique direct des garde-côtes chinois sur un marin
philippin, à partir du bulletin du 21/07/2026 (sources B2/A2). Aucune
évolution éligible (crédibilité ≤3, nouveauté réelle) identifiée pour
l'Excel ou le PPTX cette semaine.

Co-Authored-By: Claude Sonnet 5 <noreply@anthropic.com>
Claude-Session: https://claude.ai/code/session_01U1QDkmDRNsH3yNFzNqukpB
</commit_message>
<xml_diff>
--- a/documents/Analyse_Capacites_Militaires_Chinoises.docx
+++ b/documents/Analyse_Capacites_Militaires_Chinoises.docx
@@ -2376,6 +2376,30 @@
           <w:szCs w:val="18"/>
         </w:rPr>
         <w:t xml:space="preserve">SOURCE : IISS, The Military Balance 2026, p.258-259</w:t>
+      </w:r>
+    </w:p>
+    <w:p>
+      <w:pPr>
+        <w:spacing w:after="160"/>
+        <w:jc w:val="both"/>
+      </w:pPr>
+      <w:r>
+        <w:t xml:space="preserve">Un développement daté du 20 juillet 2026 illustre un abaissement du seuil tactique au sein de ce niveau de coercition visible : lors d'une confrontation près du BRP Sierra Madre à Second Thomas Shoal (Ayungin, Spratleys), un garde-côte chinois a frappé physiquement un marin philippin, le blessant — un premier contact physique direct documenté après plusieurs mois de recours à des moyens non létaux (canons à eau, lasers) [autorités philippines ; Département d'État américain]. Pékin conteste cette version et affirme que des embarcations philippines ont délibérément heurté un navire chinois après un appareillage jugé « illégal » depuis le Sierra Madre [porte-parole des garde-côtes chinois via presse régionale — version contestée, non tranchée]. Cet épisode reste conforme au registre d'action de la Garde-côtière (Niveau 2) et ne constitue pas, en l'état des indicateurs disponibles, une preuve de volonté d'escalade soutenue au-delà de la stratégie de coercition graduée déjà établie — la distinction capacité/intention doit être maintenue avec rigueur. Il constitue néanmoins un indicateur concret à suivre pour toute évolution ultérieure du registre de coercition en mer de Chine méridionale.</w:t>
+      </w:r>
+    </w:p>
+    <w:p>
+      <w:pPr>
+        <w:spacing w:after="220"/>
+      </w:pPr>
+      <w:r>
+        <w:rPr>
+          <w:i/>
+          <w:iCs/>
+          <w:color w:val="595959"/>
+          <w:sz w:val="18"/>
+          <w:szCs w:val="18"/>
+        </w:rPr>
+        <w:t xml:space="preserve">SOURCE : OSINT : autorités philippines et Département d'État américain (communiqué du 21/07/2026), relayés par South China Morning Post et Philstar, [B2]/[A2] ; bulletin de veille interne, 21/07/2026</w:t>
       </w:r>
     </w:p>
     <w:p>

</xml_diff>

<commit_message>
Mise à jour hebdomadaire — 2026-08-10
Intègre l'unique évolution du bulletin 2026-07-21 franchissant le seuil de
crédibilité (B2/A2, sources indépendantes recoupées) : l'incident du
20 juillet à Second Thomas Shoal (contact physique garde-côte chinois/marin
philippin), qui matérialise concrètement la stratégie de coercition graduée
décrite en section 6.3 de la note Word.

Co-Authored-By: Claude Sonnet 5 <noreply@anthropic.com>
Claude-Session: https://claude.ai/code/session_01ULRG2e6q9TujfqdZfhxrTr
</commit_message>
<xml_diff>
--- a/documents/Analyse_Capacites_Militaires_Chinoises.docx
+++ b/documents/Analyse_Capacites_Militaires_Chinoises.docx
@@ -2376,6 +2376,30 @@
           <w:szCs w:val="18"/>
         </w:rPr>
         <w:t xml:space="preserve">SOURCE : IISS, The Military Balance 2026, p.258-259</w:t>
+      </w:r>
+    </w:p>
+    <w:p>
+      <w:pPr>
+        <w:spacing w:after="160"/>
+        <w:jc w:val="both"/>
+      </w:pPr>
+      <w:r>
+        <w:t xml:space="preserve">Le 20 juillet 2026, un incident à Second Thomas Shoal (Spratleys) a illustré concrètement cette dynamique de coercition graduée : selon les autorités philippines, un garde-côte chinois a frappé à la tête un marin philippin lors d'une confrontation près du BRP Sierra Madre, le blessant ; Pékin conteste cette version et affirme que des embarcations philippines ont appareillé « illégalement » depuis le Sierra Madre et heurté délibérément un navire chinois — version contestée, non tranchée. Manille et Pékin ont procédé à des convocations diplomatiques réciproques de leurs ambassadeurs le 21 juillet ; Washington et Canberra ont qualifié l'action chinoise de « dangereuse ». Ce passage documenté à un contact physique direct constitue une inflexion tactique par rapport aux modes de coercition non létale (canons à eau, lasers) observés les mois précédents ; il est improbable (20-45%) que cet épisode isolé signale à lui seul une intention d'escalade soutenue au-delà du registre de coercition graduée déjà établi, en l'absence d'indicateur convergent — distinction capacité/intention à maintenir.</w:t>
+      </w:r>
+    </w:p>
+    <w:p>
+      <w:pPr>
+        <w:spacing w:after="220"/>
+      </w:pPr>
+      <w:r>
+        <w:rPr>
+          <w:i/>
+          <w:iCs/>
+          <w:color w:val="595959"/>
+          <w:sz w:val="18"/>
+          <w:szCs w:val="18"/>
+        </w:rPr>
+        <w:t xml:space="preserve">SOURCE : autorités philippines/État-major philippin et Département d'État américain [A2], South China Morning Post et Philstar [B2], 20-21/07/2026 — recoupé dans le bulletin INTSUM du 21/07/2026 (bulletins/2026-07-21.md)</w:t>
       </w:r>
     </w:p>
     <w:p>

</xml_diff>

<commit_message>
Maj hebdo 2026-08-17 : escalade Second Thomas Shoal dans l'analyse zone grise
Ajoute un paragraphe sourcé (section 6.3 de la note Word) documentant le
premier contact physique confirmé entre garde-côtes chinois et marine
philippine (20/07/2026), comme évolution tactique de la stratégie de
coercition graduée déjà recensée. Excel et PPTX non modifiés : aucun
système, chiffre ou jugement affiché n'est devenu obsolète.

Co-Authored-By: Claude Sonnet 5 <noreply@anthropic.com>
Claude-Session: https://claude.ai/code/session_011bxrAkDpjdyq99KmeStDFA
</commit_message>
<xml_diff>
--- a/documents/Analyse_Capacites_Militaires_Chinoises.docx
+++ b/documents/Analyse_Capacites_Militaires_Chinoises.docx
@@ -2376,6 +2376,30 @@
           <w:szCs w:val="18"/>
         </w:rPr>
         <w:t xml:space="preserve">SOURCE : IISS, The Military Balance 2026, p.258-259</w:t>
+      </w:r>
+    </w:p>
+    <w:p>
+      <w:pPr>
+        <w:spacing w:after="160"/>
+        <w:jc w:val="both"/>
+      </w:pPr>
+      <w:r>
+        <w:t xml:space="preserve">Un développement récent illustre cette dynamique d’escalade graduée : le 20 juillet 2026, un garde-côte chinois a frappé à la tête un marin philippin lors d’une confrontation près du BRP Sierra Madre à Second Thomas Shoal (Ayungin), dans l’archipel des Spratleys — premier contact physique documenté après plusieurs mois de coercition non létale (canons à eau, pointeurs laser). Pékin conteste cette version et affirme que des embarcations philippines ont manœuvré dangereusement à l’origine de l’incident ; Manille et Pékin ont convoqué réciproquement leurs ambassadeurs le 21 juillet, et Washington comme Canberra ont qualifié l’action chinoise de « dangereuse ». Ce passage documenté à un contact physique direct doit être lu comme une évolution tactique au sein de l’architecture de coercition graduée décrite ci-dessus, plutôt que comme un indicateur de rupture vers un engagement armé : aucun indicateur convergent (mobilisation logistique, restrictions de navigation, rupture diplomatique durable) ne permettait, à la date du 21 juillet 2026, d’établir une intention d’escalade soutenue au-delà de la posture de coercition déjà établie.</w:t>
+      </w:r>
+    </w:p>
+    <w:p>
+      <w:pPr>
+        <w:spacing w:after="220"/>
+      </w:pPr>
+      <w:r>
+        <w:rPr>
+          <w:i/>
+          <w:iCs/>
+          <w:color w:val="595959"/>
+          <w:sz w:val="18"/>
+          <w:szCs w:val="18"/>
+        </w:rPr>
+        <w:t xml:space="preserve">SOURCE : autorités philippines/État-major [B2] ; Département d’État américain, communiqué du 21/07/2026 [A2] ; South China Morning Post, 20-21/07/2026 [B2] ; Philstar, 21/07/2026 [B2] — cf. bulletin INTSUM du 21/07/2026 pour le détail du sourcing et les points de contradiction non tranchés</w:t>
       </w:r>
     </w:p>
     <w:p>

</xml_diff>

<commit_message>
Maj hebdo 2026-08-31 : incident Second Thomas Shoal dans la note Word
- [Word] Section 6.3 (zone grise) — ajout d'un paragraphe documentant
  l'incident du 20-21 juillet 2026 (garde-côte chinois frappant un marin
  philippin, premier contact physique après des mois de coercition non
  létale) comme indicateur concret d'escalade tactique, avec la réserve
  capacité/intention — sources : autorités philippines, Département d'État
  américain (A2), SCMP (B2), Philstar (B2)
- [bulletins/_a_traiter.md] Nettoyage de la ligne traitée

Aucune évolution supplémentaire ne franchissait le seuil de crédibilité
≤3 cette semaine (un seul bulletin disponible : 2026-07-21). Excel et
PPTX non modifiés : aucun chiffre ou système recensé n'est devenu obsolète
(686 navires garde-côtière inchangé, cohérent avec le PPTX slide 12).
</commit_message>
<xml_diff>
--- a/documents/Analyse_Capacites_Militaires_Chinoises.docx
+++ b/documents/Analyse_Capacites_Militaires_Chinoises.docx
@@ -2376,6 +2376,30 @@
           <w:szCs w:val="18"/>
         </w:rPr>
         <w:t xml:space="preserve">SOURCE : IISS, The Military Balance 2026, p.258-259</w:t>
+      </w:r>
+    </w:p>
+    <w:p>
+      <w:pPr>
+        <w:spacing w:after="160"/>
+        <w:jc w:val="both"/>
+      </w:pPr>
+      <w:r>
+        <w:t>Un développement du 20-21 juillet 2026 illustre concrètement cette dynamique d'escalade graduée : lors d'une confrontation près du BRP Sierra Madre à Second Thomas Shoal (Ayungin, Spratleys), un garde-côte chinois a frappé à la tête un marin philippin, le blessant — premier contact physique direct documenté après plusieurs mois de coercition non létale (canons à eau, lasers). Pékin conteste cette version et impute l'incident à une manœuvre philippine jugée illégale — version contestée, non tranchée à ce stade. Conformément à la distinction capacité/intention, cet épisode ponctuel ne permet pas, à lui seul, d'établir une inflexion durable de la posture chinoise vers une coercition physique systématique ; il constitue néanmoins un point de vigilance concret à intégrer au suivi de l'architecture à trois niveaux décrite ci-dessus.</w:t>
+      </w:r>
+    </w:p>
+    <w:p>
+      <w:pPr>
+        <w:spacing w:after="220"/>
+      </w:pPr>
+      <w:r>
+        <w:rPr>
+          <w:i/>
+          <w:iCs/>
+          <w:color w:val="595959"/>
+          <w:sz w:val="18"/>
+          <w:szCs w:val="18"/>
+        </w:rPr>
+        <w:t>SOURCE : autorités philippines/État-major, Département d'État américain (A2), South China Morning Post (B2), Philstar (B2), 20-21/07/2026 — synthétisé dans le bulletin quotidien du 21/07/2026 (bulletins/2026-07-21.md)</w:t>
       </w:r>
     </w:p>
     <w:p>

</xml_diff>